<commit_message>
update testing plan for milestone 2
</commit_message>
<xml_diff>
--- a/milestone2/testing_plan.docx
+++ b/milestone2/testing_plan.docx
@@ -167,19 +167,11 @@
           <w:iCs/>
         </w:rPr>
       </w:pPr>
-      <w:proofErr w:type="spellStart"/>
       <w:r>
         <w:rPr>
           <w:rStyle w:val="Emphasis"/>
         </w:rPr>
-        <w:t>Traedon</w:t>
-      </w:r>
-      <w:proofErr w:type="spellEnd"/>
-      <w:r>
-        <w:rPr>
-          <w:rStyle w:val="Emphasis"/>
-        </w:rPr>
-        <w:t xml:space="preserve"> Harris</w:t>
+        <w:t>Traedon Harris</w:t>
       </w:r>
     </w:p>
     <w:p>
@@ -1345,23 +1337,7 @@
         </w:numPr>
       </w:pPr>
       <w:r>
-        <w:t>Basic phone state management (</w:t>
-      </w:r>
-      <w:proofErr w:type="spellStart"/>
-      <w:r>
-        <w:t>onhook</w:t>
-      </w:r>
-      <w:proofErr w:type="spellEnd"/>
-      <w:r>
-        <w:t xml:space="preserve">, </w:t>
-      </w:r>
-      <w:proofErr w:type="spellStart"/>
-      <w:r>
-        <w:t>offhook</w:t>
-      </w:r>
-      <w:proofErr w:type="spellEnd"/>
-      <w:r>
-        <w:t>, idle, busy, ringing)</w:t>
+        <w:t>Basic phone state management (onhook, offhook, idle, busy, ringing)</w:t>
       </w:r>
     </w:p>
     <w:p>
@@ -1397,15 +1373,7 @@
         </w:numPr>
       </w:pPr>
       <w:r>
-        <w:t>Call termination (</w:t>
-      </w:r>
-      <w:proofErr w:type="spellStart"/>
-      <w:r>
-        <w:t>onhook</w:t>
-      </w:r>
-      <w:proofErr w:type="spellEnd"/>
-      <w:r>
-        <w:t xml:space="preserve"> command)</w:t>
+        <w:t>Call termination (onhook command)</w:t>
       </w:r>
     </w:p>
     <w:p>
@@ -1477,15 +1445,7 @@
         </w:numPr>
       </w:pPr>
       <w:r>
-        <w:t xml:space="preserve">Support for </w:t>
-      </w:r>
-      <w:proofErr w:type="gramStart"/>
-      <w:r>
-        <w:t>comments (#</w:t>
-      </w:r>
-      <w:proofErr w:type="gramEnd"/>
-      <w:r>
-        <w:t>) and blank lines in phones.txt</w:t>
+        <w:t>Support for comments (#) and blank lines in phones.txt</w:t>
       </w:r>
     </w:p>
     <w:p>
@@ -1737,23 +1697,7 @@
         </w:numPr>
       </w:pPr>
       <w:r>
-        <w:t>Complete call scenarios (</w:t>
-      </w:r>
-      <w:proofErr w:type="spellStart"/>
-      <w:r>
-        <w:t>offhook</w:t>
-      </w:r>
-      <w:proofErr w:type="spellEnd"/>
-      <w:r>
-        <w:t xml:space="preserve"> → call → conversation → </w:t>
-      </w:r>
-      <w:proofErr w:type="spellStart"/>
-      <w:r>
-        <w:t>onhook</w:t>
-      </w:r>
-      <w:proofErr w:type="spellEnd"/>
-      <w:r>
-        <w:t>)</w:t>
+        <w:t>Complete call scenarios (offhook → call → conversation → onhook)</w:t>
       </w:r>
     </w:p>
     <w:p>
@@ -2061,28 +2005,7 @@
         </w:numPr>
       </w:pPr>
       <w:r>
-        <w:t xml:space="preserve">Operations on phones </w:t>
-      </w:r>
-      <w:proofErr w:type="gramStart"/>
-      <w:r>
-        <w:t>in</w:t>
-      </w:r>
-      <w:proofErr w:type="gramEnd"/>
-      <w:r>
-        <w:t xml:space="preserve"> wrong states (e.g., calling </w:t>
-      </w:r>
-      <w:proofErr w:type="gramStart"/>
-      <w:r>
-        <w:t xml:space="preserve">while </w:t>
-      </w:r>
-      <w:proofErr w:type="spellStart"/>
-      <w:r>
-        <w:t>onhook</w:t>
-      </w:r>
-      <w:proofErr w:type="spellEnd"/>
-      <w:proofErr w:type="gramEnd"/>
-      <w:r>
-        <w:t>)</w:t>
+        <w:t>Operations on phones in wrong states (e.g., calling while onhook)</w:t>
       </w:r>
     </w:p>
     <w:p>
@@ -2369,15 +2292,7 @@
         </w:numPr>
       </w:pPr>
       <w:r>
-        <w:t>Names: 1 character (a), 12 characters (</w:t>
-      </w:r>
-      <w:proofErr w:type="spellStart"/>
-      <w:r>
-        <w:t>abcdefghijkl</w:t>
-      </w:r>
-      <w:proofErr w:type="spellEnd"/>
-      <w:r>
-        <w:t>), 13 characters (invalid)</w:t>
+        <w:t>Names: 1 character (a), 12 characters (abcdefghijkl), 13 characters (invalid)</w:t>
       </w:r>
     </w:p>
     <w:p>
@@ -2498,31 +2413,7 @@
         </w:numPr>
       </w:pPr>
       <w:r>
-        <w:t xml:space="preserve">Phone </w:t>
-      </w:r>
-      <w:proofErr w:type="gramStart"/>
-      <w:r>
-        <w:t>states</w:t>
-      </w:r>
-      <w:proofErr w:type="gramEnd"/>
-      <w:r>
-        <w:t xml:space="preserve">: </w:t>
-      </w:r>
-      <w:proofErr w:type="spellStart"/>
-      <w:r>
-        <w:t>Onhook</w:t>
-      </w:r>
-      <w:proofErr w:type="spellEnd"/>
-      <w:r>
-        <w:t xml:space="preserve"> (Idle) → </w:t>
-      </w:r>
-      <w:proofErr w:type="spellStart"/>
-      <w:r>
-        <w:t>Offhook</w:t>
-      </w:r>
-      <w:proofErr w:type="spellEnd"/>
-      <w:r>
-        <w:t xml:space="preserve"> → Ringing → Connected → Busy</w:t>
+        <w:t>Phone states: Onhook (Idle) → Offhook → Ringing → Connected → Busy</w:t>
       </w:r>
     </w:p>
     <w:p>
@@ -2587,15 +2478,7 @@
         </w:numPr>
       </w:pPr>
       <w:r>
-        <w:t xml:space="preserve">Case sensitivity issues (ALICE vs </w:t>
-      </w:r>
-      <w:proofErr w:type="spellStart"/>
-      <w:r>
-        <w:t>alice</w:t>
-      </w:r>
-      <w:proofErr w:type="spellEnd"/>
-      <w:r>
-        <w:t xml:space="preserve"> vs Alice)</w:t>
+        <w:t>Case sensitivity issues (ALICE vs alice vs Alice)</w:t>
       </w:r>
     </w:p>
     <w:p>
@@ -2631,21 +2514,8 @@
         </w:numPr>
       </w:pPr>
       <w:r>
-        <w:t xml:space="preserve">Concurrent </w:t>
-      </w:r>
-      <w:proofErr w:type="gramStart"/>
-      <w:r>
-        <w:t>state</w:t>
-      </w:r>
-      <w:proofErr w:type="gramEnd"/>
-      <w:r>
-        <w:t xml:space="preserve"> </w:t>
-      </w:r>
-      <w:proofErr w:type="gramStart"/>
-      <w:r>
-        <w:t>changes</w:t>
-      </w:r>
-      <w:proofErr w:type="gramEnd"/>
+        <w:t>Concurrent state changes</w:t>
+      </w:r>
     </w:p>
     <w:p>
       <w:pPr>
@@ -2861,7 +2731,7 @@
         <w:t xml:space="preserve"> </w:t>
       </w:r>
       <w:r>
-        <w:t>Testing via Python Subprocess</w:t>
+        <w:t>Manual Testing</w:t>
       </w:r>
     </w:p>
     <w:p>
@@ -2880,7 +2750,7 @@
         <w:t>Command Line:</w:t>
       </w:r>
       <w:r>
-        <w:t xml:space="preserve"> PowerShell (Windows) or Terminal (macOS/Linux)</w:t>
+        <w:t xml:space="preserve"> PowerShell (Windows)</w:t>
       </w:r>
     </w:p>
     <w:p>
@@ -2976,23 +2846,7 @@
         </w:numPr>
       </w:pPr>
       <w:r>
-        <w:t>Valid command sequences (</w:t>
-      </w:r>
-      <w:proofErr w:type="spellStart"/>
-      <w:r>
-        <w:t>offhook</w:t>
-      </w:r>
-      <w:proofErr w:type="spellEnd"/>
-      <w:r>
-        <w:t xml:space="preserve"> → call → </w:t>
-      </w:r>
-      <w:proofErr w:type="spellStart"/>
-      <w:r>
-        <w:t>onhook</w:t>
-      </w:r>
-      <w:proofErr w:type="spellEnd"/>
-      <w:r>
-        <w:t>)</w:t>
+        <w:t>Valid command sequences (offhook → call → onhook)</w:t>
       </w:r>
     </w:p>
     <w:p>
@@ -3069,15 +2923,7 @@
         </w:numPr>
       </w:pPr>
       <w:r>
-        <w:t>Malformed phone numbers: "123", "123456", "</w:t>
-      </w:r>
-      <w:proofErr w:type="spellStart"/>
-      <w:r>
-        <w:t>abcde</w:t>
-      </w:r>
-      <w:proofErr w:type="spellEnd"/>
-      <w:r>
-        <w:t>", "1234A"</w:t>
+        <w:t>Malformed phone numbers: "123", "123456", "abcde", "1234A"</w:t>
       </w:r>
     </w:p>
     <w:p>
@@ -3089,15 +2935,7 @@
         </w:numPr>
       </w:pPr>
       <w:r>
-        <w:t>Invalid names: "Alice123", "Bob!", "", "</w:t>
-      </w:r>
-      <w:proofErr w:type="spellStart"/>
-      <w:r>
-        <w:t>VeryLongNameHere</w:t>
-      </w:r>
-      <w:proofErr w:type="spellEnd"/>
-      <w:r>
-        <w:t>"</w:t>
+        <w:t>Invalid names: "Alice123", "Bob!", "", "VeryLongNameHere"</w:t>
       </w:r>
     </w:p>
     <w:p>
@@ -3109,15 +2947,7 @@
         </w:numPr>
       </w:pPr>
       <w:r>
-        <w:t>Malformed commands: "</w:t>
-      </w:r>
-      <w:proofErr w:type="spellStart"/>
-      <w:r>
-        <w:t>offhook</w:t>
-      </w:r>
-      <w:proofErr w:type="spellEnd"/>
-      <w:r>
-        <w:t>", "call Alice Bob", "INVALIDCMD"</w:t>
+        <w:t>Malformed commands: "offhook", "call Alice Bob", "INVALIDCMD"</w:t>
       </w:r>
     </w:p>
     <w:p>
@@ -3230,15 +3060,7 @@
         </w:numPr>
       </w:pPr>
       <w:r>
-        <w:t xml:space="preserve">Sequential calls </w:t>
-      </w:r>
-      <w:proofErr w:type="gramStart"/>
-      <w:r>
-        <w:t>creating</w:t>
-      </w:r>
-      <w:proofErr w:type="gramEnd"/>
-      <w:r>
-        <w:t xml:space="preserve"> complex state scenarios</w:t>
+        <w:t>Sequential calls creating complex state scenarios</w:t>
       </w:r>
     </w:p>
     <w:p>
@@ -3421,31 +3243,7 @@
         </w:numPr>
       </w:pPr>
       <w:r>
-        <w:t>Dual-core processor</w:t>
-      </w:r>
-    </w:p>
-    <w:p>
-      <w:pPr>
-        <w:pStyle w:val="ListParagraph"/>
-        <w:numPr>
-          <w:ilvl w:val="0"/>
-          <w:numId w:val="25"/>
-        </w:numPr>
-      </w:pPr>
-      <w:r>
-        <w:t>20GB available storage</w:t>
-      </w:r>
-    </w:p>
-    <w:p>
-      <w:pPr>
-        <w:pStyle w:val="ListParagraph"/>
-        <w:numPr>
-          <w:ilvl w:val="0"/>
-          <w:numId w:val="25"/>
-        </w:numPr>
-      </w:pPr>
-      <w:r>
-        <w:t>Multiple OS support for cross-platform testing</w:t>
+        <w:t>~1GB available storage</w:t>
       </w:r>
     </w:p>
     <w:p>
@@ -3482,19 +3280,10 @@
         </w:numPr>
       </w:pPr>
       <w:r>
-        <w:t xml:space="preserve">Python 3.9+ </w:t>
-      </w:r>
-    </w:p>
-    <w:p>
-      <w:pPr>
-        <w:pStyle w:val="ListParagraph"/>
-        <w:numPr>
-          <w:ilvl w:val="0"/>
-          <w:numId w:val="26"/>
-        </w:numPr>
-      </w:pPr>
-      <w:r>
         <w:t>Command Line Interface</w:t>
+      </w:r>
+      <w:r>
+        <w:t xml:space="preserve"> (Powershell)</w:t>
       </w:r>
     </w:p>
     <w:p>
@@ -3558,7 +3347,7 @@
         </w:numPr>
       </w:pPr>
       <w:r>
-        <w:t>5-7 pre-configured phones.txt files for different scenarios</w:t>
+        <w:t>phones.txt files for different scenarios</w:t>
       </w:r>
     </w:p>
     <w:p>
@@ -3583,18 +3372,6 @@
       </w:pPr>
       <w:r>
         <w:t>Expected output files for comparison</w:t>
-      </w:r>
-    </w:p>
-    <w:p>
-      <w:pPr>
-        <w:pStyle w:val="ListParagraph"/>
-        <w:numPr>
-          <w:ilvl w:val="0"/>
-          <w:numId w:val="29"/>
-        </w:numPr>
-      </w:pPr>
-      <w:r>
-        <w:t>State transition diagrams for reference</w:t>
       </w:r>
     </w:p>
     <w:p>
@@ -3619,7 +3396,7 @@
         </w:numPr>
       </w:pPr>
       <w:r>
-        <w:t>Source code with inline comments</w:t>
+        <w:t>Test case templates</w:t>
       </w:r>
     </w:p>
     <w:p>
@@ -3631,7 +3408,7 @@
         </w:numPr>
       </w:pPr>
       <w:r>
-        <w:t>README.md with execution instructions</w:t>
+        <w:t>Bug report</w:t>
       </w:r>
     </w:p>
     <w:p>
@@ -3643,43 +3420,7 @@
         </w:numPr>
       </w:pPr>
       <w:r>
-        <w:t>How to execute program</w:t>
-      </w:r>
-    </w:p>
-    <w:p>
-      <w:pPr>
-        <w:pStyle w:val="ListParagraph"/>
-        <w:numPr>
-          <w:ilvl w:val="0"/>
-          <w:numId w:val="28"/>
-        </w:numPr>
-      </w:pPr>
-      <w:r>
-        <w:t>How to run test cases</w:t>
-      </w:r>
-    </w:p>
-    <w:p>
-      <w:pPr>
-        <w:pStyle w:val="ListParagraph"/>
-        <w:numPr>
-          <w:ilvl w:val="0"/>
-          <w:numId w:val="28"/>
-        </w:numPr>
-      </w:pPr>
-      <w:r>
-        <w:t>Test case templates</w:t>
-      </w:r>
-    </w:p>
-    <w:p>
-      <w:pPr>
-        <w:pStyle w:val="ListParagraph"/>
-        <w:numPr>
-          <w:ilvl w:val="0"/>
-          <w:numId w:val="28"/>
-        </w:numPr>
-      </w:pPr>
-      <w:r>
-        <w:t>Exporting test results to Excel</w:t>
+        <w:t>Post testing analysis</w:t>
       </w:r>
       <w:r>
         <w:br w:type="page"/>
@@ -11689,7 +11430,6 @@
   <w:style w:type="character" w:default="1" w:styleId="DefaultParagraphFont">
     <w:name w:val="Default Paragraph Font"/>
     <w:uiPriority w:val="1"/>
-    <w:semiHidden/>
     <w:unhideWhenUsed/>
   </w:style>
   <w:style w:type="table" w:default="1" w:styleId="TableNormal">

</xml_diff>